<commit_message>
feat(epod): lock e-POD signing during transit, require manual QC verification for delivery, and update prep docs
</commit_message>
<xml_diff>
--- a/prep/TrackPoint_Presentation_Script.docx
+++ b/prep/TrackPoint_Presentation_Script.docx
@@ -677,7 +677,7 @@
           <w:color w:val="78350F"/>
           <w:sz w:val="18"/>
         </w:rPr>
-        <w:t>Use your hands to illustrate the progression across the 5 stages. Emphasize Stage 4 (Arrived).</w:t>
+        <w:t>Use your hands to illustrate the progression across the 5 stages. Emphasize Stage 4 (Arrived) and the transit lockout.</w:t>
       </w:r>
     </w:p>
     <w:p>
@@ -707,11 +707,11 @@
         <w:br/>
         <w:t>Stage 2 is 'Assigned': the dispatcher checks driver fatigue hours and approves the match.</w:t>
         <w:br/>
-        <w:t>Stage 3 is 'In Transit': the vehicle journeys down the Stuart Highway at 88 to 95 km/h.</w:t>
+        <w:t>Stage 3 is 'In Transit': the vehicle journeys down the Stuart Highway at 88 to 95 km/h. During this stage, the driver handset explicitly locks the e-POD signature pad with an amber warning banner. A driver cannot sign an e-POD while in transit—it is technically blocked.</w:t>
         <w:br/>
-        <w:t>Stage 4 is 'Arrived': when the heavy vehicle pulls into the destination receiving dock, the truck comes to a complete halt at 0 km/h and transitions to 'Arrived' with a distinct purple status. The driver CANNOT mark the job delivered.</w:t>
+        <w:t>Stage 4 is 'Arrived': when the heavy vehicle pulls into the destination receiving dock, the truck comes to a complete halt at 0 km/h and transitions to 'Arrived' with a distinct purple status. The driver STILL cannot mark the job delivered.</w:t>
         <w:br/>
-        <w:t>And Stage 5 is 'Delivered': custody transfers ONLY after physical security seal verification, temperature checks, and a legal digital signature are captured."</w:t>
+        <w:t>And Stage 5 is 'Delivered': custody transfers ONLY after a human supervisor manually conducts the Quality Check (bolt security seal check, +4°C reefer temperature check) and captures the digital e-POD signature. Someone must manually verify QC and update the status to Delivered, which releases the invoice."</w:t>
       </w:r>
     </w:p>
     <w:p>
@@ -786,7 +786,7 @@
         <w:t>Under the Australian Heavy Vehicle National Law, Chain of Responsibility (CoR) makes both the carrier and the receiver legally liable for cargo condition. If a refrigerated container of beef warms up past +4°C during outback transit, or if a container bolt seal is snapped, NorthLine could face a $100,000 claim.</w:t>
         <w:br/>
         <w:br/>
-        <w:t>In TrackPoint, when the vehicle reaches the dock, the admin or receiver opens the 'QC &amp; e-POD Sign-off' dialog. The receiver must explicitly verify:</w:t>
+        <w:t>That is why someone must manually update the status to Delivered after verifying QC has passed. In TrackPoint, when the vehicle reaches the dock, the supervisor opens the 'QC &amp; e-POD Sign-off' dialog. The receiver must explicitly verify:</w:t>
         <w:br/>
         <w:t>1. High-security bolt seal integrity (#NT-89422-SEC).</w:t>
         <w:br/>
@@ -797,7 +797,7 @@
         <w:t>And 4. The receiver's authorized name, title, and digital signature.</w:t>
         <w:br/>
         <w:br/>
-        <w:t>Only when this form is submitted does the system unlock the 'Delivered' state and trigger billing. This single feature bridges academic software engineering with commercial enterprise supply chain standards."</w:t>
+        <w:t>Only when the supervisor clicks 'Approve QC &amp; Sign e-POD' does the status manually update to 'Delivered' and trigger the tax invoice. This eliminates premature drop-off fraud and bridges academic software engineering with commercial enterprise standards."</w:t>
       </w:r>
     </w:p>
     <w:p>

</xml_diff>